<commit_message>
6/16/2026 SRS'leri mergelemeden okuyup kontrol ediyorum.
</commit_message>
<xml_diff>
--- a/PronounceAll_Handoff_Document.docx
+++ b/PronounceAll_Handoff_Document.docx
@@ -380,8 +380,17 @@
           <w:rFonts w:ascii="Roboto Mono" w:eastAsia="Roboto Mono" w:hAnsi="Roboto Mono" w:cs="Roboto Mono"/>
           <w:color w:val="188038"/>
         </w:rPr>
-        <w:t>pronounceall.com/:variant/:word</w:t>
-      </w:r>
+        <w:t>pronounceall.com</w:t>
+      </w:r>
+      <w:proofErr w:type="gramStart"/>
+      <w:r>
+        <w:rPr>
+          <w:rFonts w:ascii="Roboto Mono" w:eastAsia="Roboto Mono" w:hAnsi="Roboto Mono" w:cs="Roboto Mono"/>
+          <w:color w:val="188038"/>
+        </w:rPr>
+        <w:t>/:variant/:word</w:t>
+      </w:r>
+      <w:proofErr w:type="gramEnd"/>
       <w:r>
         <w:t xml:space="preserve"> where variant is a language variant code like </w:t>
       </w:r>
@@ -596,26 +605,34 @@
         <w:spacing w:before="240" w:after="240"/>
       </w:pPr>
       <w:r>
-        <w:t xml:space="preserve">The tag affects how the word appears in practice sessions. Untagged and "learning" words are asked at full frequency. "Learned" words are asked at half frequency. This same save/tag mechanism also applies to individual IPA phonemes on the </w:t>
-      </w:r>
-      <w:r>
-        <w:rPr>
-          <w:rFonts w:ascii="Roboto Mono" w:eastAsia="Roboto Mono" w:hAnsi="Roboto Mono" w:cs="Roboto Mono"/>
-          <w:color w:val="188038"/>
-        </w:rPr>
+        <w:t xml:space="preserve">The tag affects how the word appears in practice sessions. Untagged and "learning" words are asked at full frequency. "Learned" words are asked at half frequency. </w:t>
+      </w:r>
+      <w:r>
+        <w:t>This same save/tag mechanism also applies to individual IPA phonemes on both the /</w:t>
+      </w:r>
+      <w:proofErr w:type="spellStart"/>
+      <w:r>
+        <w:t>learnIPA</w:t>
+      </w:r>
+      <w:proofErr w:type="spellEnd"/>
+      <w:r>
+        <w:t xml:space="preserve"> page (global, all variants) and the </w:t>
+      </w:r>
+      <w:proofErr w:type="gramStart"/>
+      <w:r>
+        <w:t>/:variant</w:t>
+      </w:r>
+      <w:proofErr w:type="gramEnd"/>
+      <w:r>
         <w:t>/</w:t>
       </w:r>
       <w:proofErr w:type="spellStart"/>
       <w:r>
-        <w:rPr>
-          <w:rFonts w:ascii="Roboto Mono" w:eastAsia="Roboto Mono" w:hAnsi="Roboto Mono" w:cs="Roboto Mono"/>
-          <w:color w:val="188038"/>
-        </w:rPr>
         <w:t>learnIPA</w:t>
       </w:r>
       <w:proofErr w:type="spellEnd"/>
       <w:r>
-        <w:t xml:space="preserve"> page.</w:t>
+        <w:t xml:space="preserve"> page (per-language).</w:t>
       </w:r>
     </w:p>
     <w:p>
@@ -813,26 +830,26 @@
         <w:spacing w:before="240" w:after="240"/>
       </w:pPr>
       <w:r>
-        <w:t xml:space="preserve">The banner links to </w:t>
-      </w:r>
-      <w:r>
-        <w:rPr>
-          <w:rFonts w:ascii="Roboto Mono" w:eastAsia="Roboto Mono" w:hAnsi="Roboto Mono" w:cs="Roboto Mono"/>
-          <w:color w:val="188038"/>
-        </w:rPr>
-        <w:t>pronounceall.com/</w:t>
-      </w:r>
-      <w:proofErr w:type="spellStart"/>
-      <w:r>
-        <w:rPr>
-          <w:rFonts w:ascii="Roboto Mono" w:eastAsia="Roboto Mono" w:hAnsi="Roboto Mono" w:cs="Roboto Mono"/>
-          <w:color w:val="188038"/>
-        </w:rPr>
+        <w:t>The banner links to pronounceall.com/</w:t>
+      </w:r>
+      <w:proofErr w:type="spellStart"/>
+      <w:r>
+        <w:t>en</w:t>
+      </w:r>
+      <w:proofErr w:type="spellEnd"/>
+      <w:r>
+        <w:t>-us/</w:t>
+      </w:r>
+      <w:proofErr w:type="spellStart"/>
+      <w:r>
         <w:t>learnIPA</w:t>
       </w:r>
       <w:proofErr w:type="spellEnd"/>
       <w:r>
-        <w:t>. This page teaches each IPA symbol with its sound and an example word. Symbols are ordered by frequency in English, from most common to least. Each row on this page has the symbol, a play button, the example word, and the same save/tag system (save / learning / learned) that word pages have.</w:t>
+        <w:t xml:space="preserve"> (the per-language page for the user's active variant).</w:t>
+      </w:r>
+      <w:r>
+        <w:t xml:space="preserve"> This page teaches each IPA symbol with its sound and an example word. Symbols are ordered by frequency in English, from most common to least. Each row on this page has the symbol, a play button, the example word, and the same save/tag system (save / learning / learned) that word pages have.</w:t>
       </w:r>
     </w:p>
     <w:p>
@@ -950,7 +967,15 @@
       </w:r>
       <w:proofErr w:type="spellEnd"/>
       <w:r>
-        <w:t xml:space="preserve"> is open-source and free. We don't want your data, we want to share knowledge." It can be closed with an X. When closed, it stays hidden for 30 minutes, then reappears. The 30-minute state is kept in </w:t>
+        <w:t xml:space="preserve"> is open-source and free. We don't want your </w:t>
+      </w:r>
+      <w:proofErr w:type="gramStart"/>
+      <w:r>
+        <w:t>data,</w:t>
+      </w:r>
+      <w:proofErr w:type="gramEnd"/>
+      <w:r>
+        <w:t xml:space="preserve"> we want to share knowledge." It can be closed with an X. When closed, it stays hidden for 30 minutes, then reappears. The 30-minute state is kept in </w:t>
       </w:r>
       <w:proofErr w:type="spellStart"/>
       <w:r>
@@ -1466,7 +1491,15 @@
         <w:spacing w:before="240" w:after="240"/>
       </w:pPr>
       <w:r>
-        <w:t>Every cookie is documented in a cookie table and justified. Essential cookies are the only ones set by default; anything non-essential requires explicit opt-in.</w:t>
+        <w:t>Every cookie is documented in a cookie table and justified. Essential cookies are the only ones set by default; anything non-</w:t>
+      </w:r>
+      <w:proofErr w:type="gramStart"/>
+      <w:r>
+        <w:t>essential</w:t>
+      </w:r>
+      <w:proofErr w:type="gramEnd"/>
+      <w:r>
+        <w:t xml:space="preserve"> requires explicit opt-in.</w:t>
       </w:r>
     </w:p>
     <w:p>
@@ -1594,8 +1627,17 @@
           <w:rFonts w:ascii="Roboto Mono" w:eastAsia="Roboto Mono" w:hAnsi="Roboto Mono" w:cs="Roboto Mono"/>
           <w:color w:val="188038"/>
         </w:rPr>
-        <w:t>GET /:variant/:word</w:t>
-      </w:r>
+        <w:t xml:space="preserve">GET </w:t>
+      </w:r>
+      <w:proofErr w:type="gramStart"/>
+      <w:r>
+        <w:rPr>
+          <w:rFonts w:ascii="Roboto Mono" w:eastAsia="Roboto Mono" w:hAnsi="Roboto Mono" w:cs="Roboto Mono"/>
+          <w:color w:val="188038"/>
+        </w:rPr>
+        <w:t>/:variant/:word</w:t>
+      </w:r>
+      <w:proofErr w:type="gramEnd"/>
       <w:r>
         <w:t xml:space="preserve"> rendering word, meaning, and static IPA transcription. URL normalization. 404 with fuzzy-match suggestions and word-request capture. Responsive mobile layout. Seed dataset of ~100 common American English words.</w:t>
       </w:r>
@@ -1627,6 +1669,15 @@
       <w:r>
         <w:t xml:space="preserve"> table seeded with all ~44 English phonemes + audio. </w:t>
       </w:r>
+      <w:proofErr w:type="gramStart"/>
+      <w:r>
+        <w:rPr>
+          <w:rFonts w:ascii="Roboto Mono" w:eastAsia="Roboto Mono" w:hAnsi="Roboto Mono" w:cs="Roboto Mono"/>
+          <w:color w:val="188038"/>
+        </w:rPr>
+        <w:t>/:variant</w:t>
+      </w:r>
+      <w:proofErr w:type="gramEnd"/>
       <w:r>
         <w:rPr>
           <w:rFonts w:ascii="Roboto Mono" w:eastAsia="Roboto Mono" w:hAnsi="Roboto Mono" w:cs="Roboto Mono"/>
@@ -1645,9 +1696,79 @@
       <w:proofErr w:type="spellEnd"/>
       <w:r>
         <w:rPr>
+          <w:rFonts w:ascii="Roboto Mono" w:eastAsia="Roboto Mono" w:hAnsi="Roboto Mono" w:cs="Roboto Mono"/>
+          <w:color w:val="188038"/>
+        </w:rPr>
+        <w:t xml:space="preserve"> </w:t>
+      </w:r>
+      <w:r>
+        <w:rPr>
           <w:rFonts w:ascii="Arial Unicode MS" w:eastAsia="Arial Unicode MS" w:hAnsi="Arial Unicode MS" w:cs="Arial Unicode MS"/>
         </w:rPr>
-        <w:t xml:space="preserve"> page with frequency-ordered phoneme list. Whole-word audio button with Wiktionary → AI TTS → Web Speech API fallback chain.</w:t>
+        <w:t>(</w:t>
+      </w:r>
+      <w:r>
+        <w:rPr>
+          <w:rFonts w:ascii="Arial Unicode MS" w:eastAsia="Arial Unicode MS" w:hAnsi="Arial Unicode MS" w:cs="Arial Unicode MS"/>
+        </w:rPr>
+        <w:t xml:space="preserve">per-language) and </w:t>
+      </w:r>
+      <w:r>
+        <w:rPr>
+          <w:rFonts w:ascii="Roboto Mono" w:eastAsia="Roboto Mono" w:hAnsi="Roboto Mono" w:cs="Roboto Mono"/>
+          <w:color w:val="188038"/>
+        </w:rPr>
+        <w:t>/</w:t>
+      </w:r>
+      <w:proofErr w:type="spellStart"/>
+      <w:r>
+        <w:rPr>
+          <w:rFonts w:ascii="Roboto Mono" w:eastAsia="Roboto Mono" w:hAnsi="Roboto Mono" w:cs="Roboto Mono"/>
+          <w:color w:val="188038"/>
+        </w:rPr>
+        <w:t>learnIPA</w:t>
+      </w:r>
+      <w:proofErr w:type="spellEnd"/>
+      <w:r>
+        <w:rPr>
+          <w:rFonts w:ascii="Roboto Mono" w:eastAsia="Roboto Mono" w:hAnsi="Roboto Mono" w:cs="Roboto Mono"/>
+          <w:color w:val="188038"/>
+        </w:rPr>
+        <w:t xml:space="preserve"> </w:t>
+      </w:r>
+      <w:bookmarkStart w:id="18" w:name="_Hlk232531679"/>
+      <w:r>
+        <w:rPr>
+          <w:rFonts w:ascii="Arial Unicode MS" w:eastAsia="Arial Unicode MS" w:hAnsi="Arial Unicode MS" w:cs="Arial Unicode MS"/>
+        </w:rPr>
+        <w:t>(global</w:t>
+      </w:r>
+      <w:bookmarkEnd w:id="18"/>
+      <w:r>
+        <w:rPr>
+          <w:rFonts w:ascii="Arial Unicode MS" w:eastAsia="Arial Unicode MS" w:hAnsi="Arial Unicode MS" w:cs="Arial Unicode MS"/>
+        </w:rPr>
+        <w:t xml:space="preserve">) pages, both with frequency-ordered phoneme lists; in v1.0 they render identical content because </w:t>
+      </w:r>
+      <w:proofErr w:type="spellStart"/>
+      <w:r>
+        <w:rPr>
+          <w:rFonts w:ascii="Arial Unicode MS" w:eastAsia="Arial Unicode MS" w:hAnsi="Arial Unicode MS" w:cs="Arial Unicode MS"/>
+        </w:rPr>
+        <w:t>en</w:t>
+      </w:r>
+      <w:proofErr w:type="spellEnd"/>
+      <w:r>
+        <w:rPr>
+          <w:rFonts w:ascii="Arial Unicode MS" w:eastAsia="Arial Unicode MS" w:hAnsi="Arial Unicode MS" w:cs="Arial Unicode MS"/>
+        </w:rPr>
+        <w:t>-us is the only seeded variant.</w:t>
+      </w:r>
+      <w:r>
+        <w:rPr>
+          <w:rFonts w:ascii="Arial Unicode MS" w:eastAsia="Arial Unicode MS" w:hAnsi="Arial Unicode MS" w:cs="Arial Unicode MS"/>
+        </w:rPr>
+        <w:t xml:space="preserve"> Whole-word audio button with Wiktionary → AI TTS → Web Speech API fallback chain.</w:t>
       </w:r>
     </w:p>
     <w:p>
@@ -1665,8 +1786,23 @@
         <w:t>Iteration 3 — Save/tag system.</w:t>
       </w:r>
       <w:r>
-        <w:t xml:space="preserve"> Three-state save for words (saved / learning / learned) and the identical system for phonemes on </w:t>
-      </w:r>
+        <w:t xml:space="preserve"> </w:t>
+      </w:r>
+      <w:r>
+        <w:t>Three-state save for words (saved / learning / learned) and the identical system for phonemes on both</w:t>
+      </w:r>
+      <w:r>
+        <w:t xml:space="preserve"> </w:t>
+      </w:r>
+      <w:proofErr w:type="gramStart"/>
+      <w:r>
+        <w:rPr>
+          <w:rFonts w:ascii="Roboto Mono" w:eastAsia="Roboto Mono" w:hAnsi="Roboto Mono" w:cs="Roboto Mono"/>
+          <w:color w:val="188038"/>
+        </w:rPr>
+        <w:t>/:variant</w:t>
+      </w:r>
+      <w:proofErr w:type="gramEnd"/>
       <w:r>
         <w:rPr>
           <w:rFonts w:ascii="Roboto Mono" w:eastAsia="Roboto Mono" w:hAnsi="Roboto Mono" w:cs="Roboto Mono"/>
@@ -1684,6 +1820,25 @@
       </w:r>
       <w:proofErr w:type="spellEnd"/>
       <w:r>
+        <w:t xml:space="preserve"> and </w:t>
+      </w:r>
+      <w:r>
+        <w:rPr>
+          <w:rFonts w:ascii="Roboto Mono" w:eastAsia="Roboto Mono" w:hAnsi="Roboto Mono" w:cs="Roboto Mono"/>
+          <w:color w:val="188038"/>
+        </w:rPr>
+        <w:t>/</w:t>
+      </w:r>
+      <w:proofErr w:type="spellStart"/>
+      <w:r>
+        <w:rPr>
+          <w:rFonts w:ascii="Roboto Mono" w:eastAsia="Roboto Mono" w:hAnsi="Roboto Mono" w:cs="Roboto Mono"/>
+          <w:color w:val="188038"/>
+        </w:rPr>
+        <w:t>learnIPA</w:t>
+      </w:r>
+      <w:proofErr w:type="spellEnd"/>
+      <w:r>
         <w:t>. Works for anonymous users immediately via UUID cookie. Append-only event log + derived state tables in place.</w:t>
       </w:r>
     </w:p>
@@ -1817,7 +1972,23 @@
           <w:b/>
           <w:bCs/>
         </w:rPr>
-        <w:t>Dependency note:</w:t>
+        <w:t xml:space="preserve">Dependency </w:t>
+      </w:r>
+      <w:proofErr w:type="gramStart"/>
+      <w:r>
+        <w:rPr>
+          <w:b/>
+          <w:bCs/>
+        </w:rPr>
+        <w:t>note</w:t>
+      </w:r>
+      <w:proofErr w:type="gramEnd"/>
+      <w:r>
+        <w:rPr>
+          <w:b/>
+          <w:bCs/>
+        </w:rPr>
+        <w:t>:</w:t>
       </w:r>
       <w:r>
         <w:t xml:space="preserve"> Features depend on each other and cannot be built in isolation. For example, the save system (Iteration 3) requires the anonymous-profile infrastructure from Iteration 0 and the word pages from Iteration 1; the authentication system (Iteration 4) must cleanly merge the already-existing anonymous data from Iteration 3; the practice sessions (Iteration 5) consume the event log established in Iteration 3. The design phase (SDD + ERD + API Spec) must anticipate all seven iterations so later features can plug into the earlier architecture without rewrites.</w:t>
@@ -1844,8 +2015,8 @@
           <w:szCs w:val="26"/>
         </w:rPr>
       </w:pPr>
-      <w:bookmarkStart w:id="18" w:name="_52ikdkbo0xvk" w:colFirst="0" w:colLast="0"/>
-      <w:bookmarkEnd w:id="18"/>
+      <w:bookmarkStart w:id="19" w:name="_52ikdkbo0xvk" w:colFirst="0" w:colLast="0"/>
+      <w:bookmarkEnd w:id="19"/>
       <w:r>
         <w:rPr>
           <w:b/>
@@ -1879,8 +2050,8 @@
           <w:szCs w:val="22"/>
         </w:rPr>
       </w:pPr>
-      <w:bookmarkStart w:id="19" w:name="_uuaxj2svivov" w:colFirst="0" w:colLast="0"/>
-      <w:bookmarkEnd w:id="19"/>
+      <w:bookmarkStart w:id="20" w:name="_uuaxj2svivov" w:colFirst="0" w:colLast="0"/>
+      <w:bookmarkEnd w:id="20"/>
       <w:r>
         <w:rPr>
           <w:b/>
@@ -1982,8 +2153,8 @@
           <w:szCs w:val="22"/>
         </w:rPr>
       </w:pPr>
-      <w:bookmarkStart w:id="20" w:name="_fsnt7ff6fx6a" w:colFirst="0" w:colLast="0"/>
-      <w:bookmarkEnd w:id="20"/>
+      <w:bookmarkStart w:id="21" w:name="_fsnt7ff6fx6a" w:colFirst="0" w:colLast="0"/>
+      <w:bookmarkEnd w:id="21"/>
       <w:r>
         <w:rPr>
           <w:b/>
@@ -2380,8 +2551,8 @@
           <w:szCs w:val="22"/>
         </w:rPr>
       </w:pPr>
-      <w:bookmarkStart w:id="21" w:name="_x8y2zboq0rjd" w:colFirst="0" w:colLast="0"/>
-      <w:bookmarkEnd w:id="21"/>
+      <w:bookmarkStart w:id="22" w:name="_x8y2zboq0rjd" w:colFirst="0" w:colLast="0"/>
+      <w:bookmarkEnd w:id="22"/>
       <w:r>
         <w:rPr>
           <w:b/>
@@ -2487,8 +2658,8 @@
           <w:szCs w:val="22"/>
         </w:rPr>
       </w:pPr>
-      <w:bookmarkStart w:id="22" w:name="_pq8hvluj9wcl" w:colFirst="0" w:colLast="0"/>
-      <w:bookmarkEnd w:id="22"/>
+      <w:bookmarkStart w:id="23" w:name="_pq8hvluj9wcl" w:colFirst="0" w:colLast="0"/>
+      <w:bookmarkEnd w:id="23"/>
       <w:r>
         <w:rPr>
           <w:b/>
@@ -2552,7 +2723,11 @@
         <w:t>LICENSE</w:t>
       </w:r>
       <w:r>
-        <w:t xml:space="preserve"> (AGPL-3.0 verbatim), </w:t>
+        <w:t xml:space="preserve"> (AGPL-3.0 verbatim)</w:t>
+      </w:r>
+      <w:proofErr w:type="gramStart"/>
+      <w:r>
+        <w:t xml:space="preserve">, </w:t>
       </w:r>
       <w:r>
         <w:rPr>
@@ -2562,6 +2737,7 @@
         <w:t>.</w:t>
       </w:r>
       <w:proofErr w:type="spellStart"/>
+      <w:proofErr w:type="gramEnd"/>
       <w:r>
         <w:rPr>
           <w:rFonts w:ascii="Roboto Mono" w:eastAsia="Roboto Mono" w:hAnsi="Roboto Mono" w:cs="Roboto Mono"/>
@@ -2577,6 +2753,7 @@
         </w:rPr>
         <w:t>/ISSUE_TEMPLATE/bug_report.md</w:t>
       </w:r>
+      <w:proofErr w:type="gramStart"/>
       <w:r>
         <w:t xml:space="preserve">, </w:t>
       </w:r>
@@ -2588,6 +2765,7 @@
         <w:t>.</w:t>
       </w:r>
       <w:proofErr w:type="spellStart"/>
+      <w:proofErr w:type="gramEnd"/>
       <w:r>
         <w:rPr>
           <w:rFonts w:ascii="Roboto Mono" w:eastAsia="Roboto Mono" w:hAnsi="Roboto Mono" w:cs="Roboto Mono"/>
@@ -2603,6 +2781,7 @@
         </w:rPr>
         <w:t>/ISSUE_TEMPLATE/feature_request.md</w:t>
       </w:r>
+      <w:proofErr w:type="gramStart"/>
       <w:r>
         <w:t xml:space="preserve">, </w:t>
       </w:r>
@@ -2614,6 +2793,7 @@
         <w:t>.</w:t>
       </w:r>
       <w:proofErr w:type="spellStart"/>
+      <w:proofErr w:type="gramEnd"/>
       <w:r>
         <w:rPr>
           <w:rFonts w:ascii="Roboto Mono" w:eastAsia="Roboto Mono" w:hAnsi="Roboto Mono" w:cs="Roboto Mono"/>
@@ -2689,8 +2869,8 @@
           <w:szCs w:val="26"/>
         </w:rPr>
       </w:pPr>
-      <w:bookmarkStart w:id="23" w:name="_ffvlp8lk8qo1" w:colFirst="0" w:colLast="0"/>
-      <w:bookmarkEnd w:id="23"/>
+      <w:bookmarkStart w:id="24" w:name="_ffvlp8lk8qo1" w:colFirst="0" w:colLast="0"/>
+      <w:bookmarkEnd w:id="24"/>
       <w:r>
         <w:rPr>
           <w:b/>
@@ -2798,8 +2978,17 @@
           <w:rFonts w:ascii="Roboto Mono" w:eastAsia="Roboto Mono" w:hAnsi="Roboto Mono" w:cs="Roboto Mono"/>
           <w:color w:val="188038"/>
         </w:rPr>
-        <w:t>pronounceall.com/:variant/:word</w:t>
-      </w:r>
+        <w:t>pronounceall.com</w:t>
+      </w:r>
+      <w:proofErr w:type="gramStart"/>
+      <w:r>
+        <w:rPr>
+          <w:rFonts w:ascii="Roboto Mono" w:eastAsia="Roboto Mono" w:hAnsi="Roboto Mono" w:cs="Roboto Mono"/>
+          <w:color w:val="188038"/>
+        </w:rPr>
+        <w:t>/:variant/:word</w:t>
+      </w:r>
+      <w:proofErr w:type="gramEnd"/>
     </w:p>
     <w:p>
       <w:pPr>
@@ -3219,8 +3408,8 @@
           <w:szCs w:val="26"/>
         </w:rPr>
       </w:pPr>
-      <w:bookmarkStart w:id="24" w:name="_w9ycp1yykxb7" w:colFirst="0" w:colLast="0"/>
-      <w:bookmarkEnd w:id="24"/>
+      <w:bookmarkStart w:id="25" w:name="_w9ycp1yykxb7" w:colFirst="0" w:colLast="0"/>
+      <w:bookmarkEnd w:id="25"/>
       <w:r>
         <w:rPr>
           <w:b/>
@@ -3417,8 +3606,8 @@
           <w:szCs w:val="26"/>
         </w:rPr>
       </w:pPr>
-      <w:bookmarkStart w:id="25" w:name="_pmcf2wy8z5ld" w:colFirst="0" w:colLast="0"/>
-      <w:bookmarkEnd w:id="25"/>
+      <w:bookmarkStart w:id="26" w:name="_pmcf2wy8z5ld" w:colFirst="0" w:colLast="0"/>
+      <w:bookmarkEnd w:id="26"/>
       <w:r>
         <w:rPr>
           <w:b/>

</xml_diff>